<commit_message>
Updated pair programming record
</commit_message>
<xml_diff>
--- a/Docs/Pair_Programming_record.docx
+++ b/Docs/Pair_Programming_record.docx
@@ -155,25 +155,66 @@
           <w:tcPr>
             <w:tcW w:w="1838" w:type="dxa"/>
           </w:tcPr>
-          <w:p/>
+          <w:p>
+            <w:r>
+              <w:t>06/10/26 (15:30-</w:t>
+            </w:r>
+            <w:r>
+              <w:t>17:00</w:t>
+            </w:r>
+            <w:r>
+              <w:t>)</w:t>
+            </w:r>
+          </w:p>
         </w:tc>
         <w:tc>
           <w:tcPr>
             <w:tcW w:w="1134" w:type="dxa"/>
           </w:tcPr>
-          <w:p/>
+          <w:p>
+            <w:r>
+              <w:t>Piran Trevenna</w:t>
+            </w:r>
+          </w:p>
         </w:tc>
         <w:tc>
           <w:tcPr>
             <w:tcW w:w="1276" w:type="dxa"/>
           </w:tcPr>
-          <w:p/>
+          <w:p>
+            <w:r>
+              <w:t>Joshua Sewell</w:t>
+            </w:r>
+          </w:p>
         </w:tc>
         <w:tc>
           <w:tcPr>
             <w:tcW w:w="4768" w:type="dxa"/>
           </w:tcPr>
-          <w:p/>
+          <w:p>
+            <w:pPr>
+              <w:pStyle w:val="ListParagraph"/>
+              <w:numPr>
+                <w:ilvl w:val="0"/>
+                <w:numId w:val="5"/>
+              </w:numPr>
+            </w:pPr>
+            <w:r>
+              <w:t>c64112</w:t>
+            </w:r>
+            <w:r>
+              <w:t>e</w:t>
+            </w:r>
+            <w:r>
+              <w:t xml:space="preserve">- </w:t>
+            </w:r>
+            <w:r>
+              <w:t xml:space="preserve">Added </w:t>
+            </w:r>
+            <w:r>
+              <w:t>method to read a pack file and refactored player count</w:t>
+            </w:r>
+          </w:p>
         </w:tc>
       </w:tr>
       <w:tr>
@@ -763,6 +804,207 @@
 <file path=word/numbering.xml><?xml version="1.0" encoding="utf-8"?>
 <w:numbering xmlns:wpc="http://schemas.microsoft.com/office/word/2010/wordprocessingCanvas" xmlns:cx="http://schemas.microsoft.com/office/drawing/2014/chartex" xmlns:cx1="http://schemas.microsoft.com/office/drawing/2015/9/8/chartex" xmlns:cx2="http://schemas.microsoft.com/office/drawing/2015/10/21/chartex" xmlns:cx3="http://schemas.microsoft.com/office/drawing/2016/5/9/chartex" xmlns:cx4="http://schemas.microsoft.com/office/drawing/2016/5/10/chartex" xmlns:cx5="http://schemas.microsoft.com/office/drawing/2016/5/11/chartex" xmlns:cx6="http://schemas.microsoft.com/office/drawing/2016/5/12/chartex" xmlns:cx7="http://schemas.microsoft.com/office/drawing/2016/5/13/chartex" xmlns:cx8="http://schemas.microsoft.com/office/drawing/2016/5/14/chartex" xmlns:mc="http://schemas.openxmlformats.org/markup-compatibility/2006" xmlns:aink="http://schemas.microsoft.com/office/drawing/2016/ink" xmlns:am3d="http://schemas.microsoft.com/office/drawing/2017/model3d" xmlns:o="urn:schemas-microsoft-com:office:office" xmlns:oel="http://schemas.microsoft.com/office/2019/extlst" xmlns:r="http://schemas.openxmlformats.org/officeDocument/2006/relationships" xmlns:m="http://schemas.openxmlformats.org/officeDocument/2006/math" xmlns:v="urn:schemas-microsoft-com:vml" xmlns:wp14="http://schemas.microsoft.com/office/word/2010/wordprocessingDrawing" xmlns:wp="http://schemas.openxmlformats.org/drawingml/2006/wordprocessingDrawing" xmlns:w10="urn:schemas-microsoft-com:office:word" xmlns:w="http://schemas.openxmlformats.org/wordprocessingml/2006/main" xmlns:w14="http://schemas.microsoft.com/office/word/2010/wordml" xmlns:w15="http://schemas.microsoft.com/office/word/2012/wordml" xmlns:w16cex="http://schemas.microsoft.com/office/word/2018/wordml/cex" xmlns:w16cid="http://schemas.microsoft.com/office/word/2016/wordml/cid" xmlns:w16="http://schemas.microsoft.com/office/word/2018/wordml" xmlns:w16du="http://schemas.microsoft.com/office/word/2023/wordml/word16du" xmlns:w16sdtdh="http://schemas.microsoft.com/office/word/2020/wordml/sdtdatahash" xmlns:w16sdtfl="http://schemas.microsoft.com/office/word/2024/wordml/sdtformatlock" xmlns:w16se="http://schemas.microsoft.com/office/word/2015/wordml/symex" xmlns:wpg="http://schemas.microsoft.com/office/word/2010/wordprocessingGroup" xmlns:wpi="http://schemas.microsoft.com/office/word/2010/wordprocessingInk" xmlns:wne="http://schemas.microsoft.com/office/word/2006/wordml" xmlns:wps="http://schemas.microsoft.com/office/word/2010/wordprocessingShape" mc:Ignorable="w14 w15 w16se w16cid w16 w16cex w16sdtdh w16sdtfl w16du wp14">
   <w:abstractNum w:abstractNumId="0" w15:restartNumberingAfterBreak="0">
+    <w:nsid w:val="20836751"/>
+    <w:multiLevelType w:val="hybridMultilevel"/>
+    <w:tmpl w:val="2E0E1E7C"/>
+    <w:lvl w:ilvl="0" w:tplc="6608C550">
+      <w:numFmt w:val="bullet"/>
+      <w:lvlText w:val="-"/>
+      <w:lvlJc w:val="left"/>
+      <w:pPr>
+        <w:ind w:left="720" w:hanging="360"/>
+      </w:pPr>
+      <w:rPr>
+        <w:rFonts w:ascii="Aptos" w:eastAsiaTheme="minorHAnsi" w:hAnsi="Aptos" w:cstheme="minorBidi" w:hint="default"/>
+      </w:rPr>
+    </w:lvl>
+    <w:lvl w:ilvl="1" w:tplc="08090003" w:tentative="1">
+      <w:start w:val="1"/>
+      <w:numFmt w:val="bullet"/>
+      <w:lvlText w:val="o"/>
+      <w:lvlJc w:val="left"/>
+      <w:pPr>
+        <w:ind w:left="1440" w:hanging="360"/>
+      </w:pPr>
+      <w:rPr>
+        <w:rFonts w:ascii="Courier New" w:hAnsi="Courier New" w:cs="Courier New" w:hint="default"/>
+      </w:rPr>
+    </w:lvl>
+    <w:lvl w:ilvl="2" w:tplc="08090005" w:tentative="1">
+      <w:start w:val="1"/>
+      <w:numFmt w:val="bullet"/>
+      <w:lvlText w:val=""/>
+      <w:lvlJc w:val="left"/>
+      <w:pPr>
+        <w:ind w:left="2160" w:hanging="360"/>
+      </w:pPr>
+      <w:rPr>
+        <w:rFonts w:ascii="Wingdings" w:hAnsi="Wingdings" w:hint="default"/>
+      </w:rPr>
+    </w:lvl>
+    <w:lvl w:ilvl="3" w:tplc="08090001" w:tentative="1">
+      <w:start w:val="1"/>
+      <w:numFmt w:val="bullet"/>
+      <w:lvlText w:val=""/>
+      <w:lvlJc w:val="left"/>
+      <w:pPr>
+        <w:ind w:left="2880" w:hanging="360"/>
+      </w:pPr>
+      <w:rPr>
+        <w:rFonts w:ascii="Symbol" w:hAnsi="Symbol" w:hint="default"/>
+      </w:rPr>
+    </w:lvl>
+    <w:lvl w:ilvl="4" w:tplc="08090003" w:tentative="1">
+      <w:start w:val="1"/>
+      <w:numFmt w:val="bullet"/>
+      <w:lvlText w:val="o"/>
+      <w:lvlJc w:val="left"/>
+      <w:pPr>
+        <w:ind w:left="3600" w:hanging="360"/>
+      </w:pPr>
+      <w:rPr>
+        <w:rFonts w:ascii="Courier New" w:hAnsi="Courier New" w:cs="Courier New" w:hint="default"/>
+      </w:rPr>
+    </w:lvl>
+    <w:lvl w:ilvl="5" w:tplc="08090005" w:tentative="1">
+      <w:start w:val="1"/>
+      <w:numFmt w:val="bullet"/>
+      <w:lvlText w:val=""/>
+      <w:lvlJc w:val="left"/>
+      <w:pPr>
+        <w:ind w:left="4320" w:hanging="360"/>
+      </w:pPr>
+      <w:rPr>
+        <w:rFonts w:ascii="Wingdings" w:hAnsi="Wingdings" w:hint="default"/>
+      </w:rPr>
+    </w:lvl>
+    <w:lvl w:ilvl="6" w:tplc="08090001" w:tentative="1">
+      <w:start w:val="1"/>
+      <w:numFmt w:val="bullet"/>
+      <w:lvlText w:val=""/>
+      <w:lvlJc w:val="left"/>
+      <w:pPr>
+        <w:ind w:left="5040" w:hanging="360"/>
+      </w:pPr>
+      <w:rPr>
+        <w:rFonts w:ascii="Symbol" w:hAnsi="Symbol" w:hint="default"/>
+      </w:rPr>
+    </w:lvl>
+    <w:lvl w:ilvl="7" w:tplc="08090003" w:tentative="1">
+      <w:start w:val="1"/>
+      <w:numFmt w:val="bullet"/>
+      <w:lvlText w:val="o"/>
+      <w:lvlJc w:val="left"/>
+      <w:pPr>
+        <w:ind w:left="5760" w:hanging="360"/>
+      </w:pPr>
+      <w:rPr>
+        <w:rFonts w:ascii="Courier New" w:hAnsi="Courier New" w:cs="Courier New" w:hint="default"/>
+      </w:rPr>
+    </w:lvl>
+    <w:lvl w:ilvl="8" w:tplc="08090005" w:tentative="1">
+      <w:start w:val="1"/>
+      <w:numFmt w:val="bullet"/>
+      <w:lvlText w:val=""/>
+      <w:lvlJc w:val="left"/>
+      <w:pPr>
+        <w:ind w:left="6480" w:hanging="360"/>
+      </w:pPr>
+      <w:rPr>
+        <w:rFonts w:ascii="Wingdings" w:hAnsi="Wingdings" w:hint="default"/>
+      </w:rPr>
+    </w:lvl>
+  </w:abstractNum>
+  <w:abstractNum w:abstractNumId="1" w15:restartNumberingAfterBreak="0">
+    <w:nsid w:val="438576B6"/>
+    <w:multiLevelType w:val="hybridMultilevel"/>
+    <w:tmpl w:val="3494A2AE"/>
+    <w:lvl w:ilvl="0" w:tplc="0809000F">
+      <w:start w:val="1"/>
+      <w:numFmt w:val="decimal"/>
+      <w:lvlText w:val="%1."/>
+      <w:lvlJc w:val="left"/>
+      <w:pPr>
+        <w:ind w:left="720" w:hanging="360"/>
+      </w:pPr>
+      <w:rPr>
+        <w:rFonts w:hint="default"/>
+      </w:rPr>
+    </w:lvl>
+    <w:lvl w:ilvl="1" w:tplc="08090019" w:tentative="1">
+      <w:start w:val="1"/>
+      <w:numFmt w:val="lowerLetter"/>
+      <w:lvlText w:val="%2."/>
+      <w:lvlJc w:val="left"/>
+      <w:pPr>
+        <w:ind w:left="1440" w:hanging="360"/>
+      </w:pPr>
+    </w:lvl>
+    <w:lvl w:ilvl="2" w:tplc="0809001B" w:tentative="1">
+      <w:start w:val="1"/>
+      <w:numFmt w:val="lowerRoman"/>
+      <w:lvlText w:val="%3."/>
+      <w:lvlJc w:val="right"/>
+      <w:pPr>
+        <w:ind w:left="2160" w:hanging="180"/>
+      </w:pPr>
+    </w:lvl>
+    <w:lvl w:ilvl="3" w:tplc="0809000F" w:tentative="1">
+      <w:start w:val="1"/>
+      <w:numFmt w:val="decimal"/>
+      <w:lvlText w:val="%4."/>
+      <w:lvlJc w:val="left"/>
+      <w:pPr>
+        <w:ind w:left="2880" w:hanging="360"/>
+      </w:pPr>
+    </w:lvl>
+    <w:lvl w:ilvl="4" w:tplc="08090019" w:tentative="1">
+      <w:start w:val="1"/>
+      <w:numFmt w:val="lowerLetter"/>
+      <w:lvlText w:val="%5."/>
+      <w:lvlJc w:val="left"/>
+      <w:pPr>
+        <w:ind w:left="3600" w:hanging="360"/>
+      </w:pPr>
+    </w:lvl>
+    <w:lvl w:ilvl="5" w:tplc="0809001B" w:tentative="1">
+      <w:start w:val="1"/>
+      <w:numFmt w:val="lowerRoman"/>
+      <w:lvlText w:val="%6."/>
+      <w:lvlJc w:val="right"/>
+      <w:pPr>
+        <w:ind w:left="4320" w:hanging="180"/>
+      </w:pPr>
+    </w:lvl>
+    <w:lvl w:ilvl="6" w:tplc="0809000F" w:tentative="1">
+      <w:start w:val="1"/>
+      <w:numFmt w:val="decimal"/>
+      <w:lvlText w:val="%7."/>
+      <w:lvlJc w:val="left"/>
+      <w:pPr>
+        <w:ind w:left="5040" w:hanging="360"/>
+      </w:pPr>
+    </w:lvl>
+    <w:lvl w:ilvl="7" w:tplc="08090019" w:tentative="1">
+      <w:start w:val="1"/>
+      <w:numFmt w:val="lowerLetter"/>
+      <w:lvlText w:val="%8."/>
+      <w:lvlJc w:val="left"/>
+      <w:pPr>
+        <w:ind w:left="5760" w:hanging="360"/>
+      </w:pPr>
+    </w:lvl>
+    <w:lvl w:ilvl="8" w:tplc="0809001B" w:tentative="1">
+      <w:start w:val="1"/>
+      <w:numFmt w:val="lowerRoman"/>
+      <w:lvlText w:val="%9."/>
+      <w:lvlJc w:val="right"/>
+      <w:pPr>
+        <w:ind w:left="6480" w:hanging="180"/>
+      </w:pPr>
+    </w:lvl>
+  </w:abstractNum>
+  <w:abstractNum w:abstractNumId="2" w15:restartNumberingAfterBreak="0">
     <w:nsid w:val="45E47A02"/>
     <w:multiLevelType w:val="hybridMultilevel"/>
     <w:tmpl w:val="C78E3E8E"/>
@@ -875,7 +1117,7 @@
       </w:rPr>
     </w:lvl>
   </w:abstractNum>
-  <w:abstractNum w:abstractNumId="1" w15:restartNumberingAfterBreak="0">
+  <w:abstractNum w:abstractNumId="3" w15:restartNumberingAfterBreak="0">
     <w:nsid w:val="4CC8647F"/>
     <w:multiLevelType w:val="hybridMultilevel"/>
     <w:tmpl w:val="93C6BE94"/>
@@ -964,7 +1206,7 @@
       </w:pPr>
     </w:lvl>
   </w:abstractNum>
-  <w:abstractNum w:abstractNumId="2" w15:restartNumberingAfterBreak="0">
+  <w:abstractNum w:abstractNumId="4" w15:restartNumberingAfterBreak="0">
     <w:nsid w:val="7C896FF8"/>
     <w:multiLevelType w:val="hybridMultilevel"/>
     <w:tmpl w:val="0CC8ADF8"/>
@@ -1054,12 +1296,18 @@
     </w:lvl>
   </w:abstractNum>
   <w:num w:numId="1" w16cid:durableId="385642863">
+    <w:abstractNumId w:val="2"/>
+  </w:num>
+  <w:num w:numId="2" w16cid:durableId="665088174">
+    <w:abstractNumId w:val="4"/>
+  </w:num>
+  <w:num w:numId="3" w16cid:durableId="435172547">
+    <w:abstractNumId w:val="3"/>
+  </w:num>
+  <w:num w:numId="4" w16cid:durableId="205796072">
     <w:abstractNumId w:val="0"/>
   </w:num>
-  <w:num w:numId="2" w16cid:durableId="665088174">
-    <w:abstractNumId w:val="2"/>
-  </w:num>
-  <w:num w:numId="3" w16cid:durableId="435172547">
+  <w:num w:numId="5" w16cid:durableId="519440871">
     <w:abstractNumId w:val="1"/>
   </w:num>
 </w:numbering>
@@ -2296,4 +2544,10 @@
     </a:ext>
   </a:extLst>
 </a:theme>
+</file>
+
+<file path=docMetadata/LabelInfo.xml><?xml version="1.0" encoding="utf-8"?>
+<clbl:labelList xmlns:clbl="http://schemas.microsoft.com/office/2020/mipLabelMetadata">
+  <clbl:label id="{912a5d77-fb98-4eee-af32-1334d8f04a53}" enabled="0" method="" siteId="{912a5d77-fb98-4eee-af32-1334d8f04a53}" removed="1"/>
+</clbl:labelList>
 </file>
</xml_diff>

<commit_message>
Pair programming record update
</commit_message>
<xml_diff>
--- a/Docs/Pair_Programming_record.docx
+++ b/Docs/Pair_Programming_record.docx
@@ -294,7 +294,13 @@
           </w:tcPr>
           <w:p>
             <w:r>
-              <w:t>13/10/26 (18:30-)</w:t>
+              <w:t>13/10/26 (18:30-</w:t>
+            </w:r>
+            <w:r>
+              <w:t>20:00</w:t>
+            </w:r>
+            <w:r>
+              <w:t>)</w:t>
             </w:r>
           </w:p>
         </w:tc>
@@ -349,10 +355,7 @@
               </w:numPr>
             </w:pPr>
             <w:r>
-              <w:t>90bcdfd</w:t>
-            </w:r>
-            <w:r>
-              <w:t xml:space="preserve"> – Added win condition checking.</w:t>
+              <w:t>90bcdfd – Added win condition checking.</w:t>
             </w:r>
           </w:p>
           <w:p>
@@ -377,25 +380,57 @@
           <w:tcPr>
             <w:tcW w:w="1838" w:type="dxa"/>
           </w:tcPr>
-          <w:p/>
+          <w:p>
+            <w:r>
+              <w:t>14/10/26 (22:05-</w:t>
+            </w:r>
+            <w:r>
+              <w:t>23:50</w:t>
+            </w:r>
+            <w:r>
+              <w:t>)</w:t>
+            </w:r>
+          </w:p>
         </w:tc>
         <w:tc>
           <w:tcPr>
             <w:tcW w:w="1134" w:type="dxa"/>
           </w:tcPr>
-          <w:p/>
+          <w:p>
+            <w:r>
+              <w:t>Joshua Sewell</w:t>
+            </w:r>
+          </w:p>
         </w:tc>
         <w:tc>
           <w:tcPr>
             <w:tcW w:w="1276" w:type="dxa"/>
           </w:tcPr>
-          <w:p/>
+          <w:p>
+            <w:r>
+              <w:t>Piran Trevenna</w:t>
+            </w:r>
+          </w:p>
         </w:tc>
         <w:tc>
           <w:tcPr>
             <w:tcW w:w="4768" w:type="dxa"/>
           </w:tcPr>
-          <w:p/>
+          <w:p>
+            <w:pPr>
+              <w:pStyle w:val="ListParagraph"/>
+              <w:numPr>
+                <w:ilvl w:val="0"/>
+                <w:numId w:val="8"/>
+              </w:numPr>
+            </w:pPr>
+            <w:r>
+              <w:t>5acea29</w:t>
+            </w:r>
+            <w:r>
+              <w:t xml:space="preserve"> – Implemented basic threaded gameplay for the player (testing still required).</w:t>
+            </w:r>
+          </w:p>
         </w:tc>
       </w:tr>
       <w:tr>
@@ -1488,6 +1523,95 @@
     </w:lvl>
   </w:abstractNum>
   <w:abstractNum w:abstractNumId="6" w15:restartNumberingAfterBreak="0">
+    <w:nsid w:val="66E65A69"/>
+    <w:multiLevelType w:val="hybridMultilevel"/>
+    <w:tmpl w:val="83E097AC"/>
+    <w:lvl w:ilvl="0" w:tplc="0809000F">
+      <w:start w:val="1"/>
+      <w:numFmt w:val="decimal"/>
+      <w:lvlText w:val="%1."/>
+      <w:lvlJc w:val="left"/>
+      <w:pPr>
+        <w:ind w:left="720" w:hanging="360"/>
+      </w:pPr>
+      <w:rPr>
+        <w:rFonts w:hint="default"/>
+      </w:rPr>
+    </w:lvl>
+    <w:lvl w:ilvl="1" w:tplc="08090019" w:tentative="1">
+      <w:start w:val="1"/>
+      <w:numFmt w:val="lowerLetter"/>
+      <w:lvlText w:val="%2."/>
+      <w:lvlJc w:val="left"/>
+      <w:pPr>
+        <w:ind w:left="1440" w:hanging="360"/>
+      </w:pPr>
+    </w:lvl>
+    <w:lvl w:ilvl="2" w:tplc="0809001B" w:tentative="1">
+      <w:start w:val="1"/>
+      <w:numFmt w:val="lowerRoman"/>
+      <w:lvlText w:val="%3."/>
+      <w:lvlJc w:val="right"/>
+      <w:pPr>
+        <w:ind w:left="2160" w:hanging="180"/>
+      </w:pPr>
+    </w:lvl>
+    <w:lvl w:ilvl="3" w:tplc="0809000F" w:tentative="1">
+      <w:start w:val="1"/>
+      <w:numFmt w:val="decimal"/>
+      <w:lvlText w:val="%4."/>
+      <w:lvlJc w:val="left"/>
+      <w:pPr>
+        <w:ind w:left="2880" w:hanging="360"/>
+      </w:pPr>
+    </w:lvl>
+    <w:lvl w:ilvl="4" w:tplc="08090019" w:tentative="1">
+      <w:start w:val="1"/>
+      <w:numFmt w:val="lowerLetter"/>
+      <w:lvlText w:val="%5."/>
+      <w:lvlJc w:val="left"/>
+      <w:pPr>
+        <w:ind w:left="3600" w:hanging="360"/>
+      </w:pPr>
+    </w:lvl>
+    <w:lvl w:ilvl="5" w:tplc="0809001B" w:tentative="1">
+      <w:start w:val="1"/>
+      <w:numFmt w:val="lowerRoman"/>
+      <w:lvlText w:val="%6."/>
+      <w:lvlJc w:val="right"/>
+      <w:pPr>
+        <w:ind w:left="4320" w:hanging="180"/>
+      </w:pPr>
+    </w:lvl>
+    <w:lvl w:ilvl="6" w:tplc="0809000F" w:tentative="1">
+      <w:start w:val="1"/>
+      <w:numFmt w:val="decimal"/>
+      <w:lvlText w:val="%7."/>
+      <w:lvlJc w:val="left"/>
+      <w:pPr>
+        <w:ind w:left="5040" w:hanging="360"/>
+      </w:pPr>
+    </w:lvl>
+    <w:lvl w:ilvl="7" w:tplc="08090019" w:tentative="1">
+      <w:start w:val="1"/>
+      <w:numFmt w:val="lowerLetter"/>
+      <w:lvlText w:val="%8."/>
+      <w:lvlJc w:val="left"/>
+      <w:pPr>
+        <w:ind w:left="5760" w:hanging="360"/>
+      </w:pPr>
+    </w:lvl>
+    <w:lvl w:ilvl="8" w:tplc="0809001B" w:tentative="1">
+      <w:start w:val="1"/>
+      <w:numFmt w:val="lowerRoman"/>
+      <w:lvlText w:val="%9."/>
+      <w:lvlJc w:val="right"/>
+      <w:pPr>
+        <w:ind w:left="6480" w:hanging="180"/>
+      </w:pPr>
+    </w:lvl>
+  </w:abstractNum>
+  <w:abstractNum w:abstractNumId="7" w15:restartNumberingAfterBreak="0">
     <w:nsid w:val="7C896FF8"/>
     <w:multiLevelType w:val="hybridMultilevel"/>
     <w:tmpl w:val="0CC8ADF8"/>
@@ -1580,7 +1704,7 @@
     <w:abstractNumId w:val="3"/>
   </w:num>
   <w:num w:numId="2" w16cid:durableId="665088174">
-    <w:abstractNumId w:val="6"/>
+    <w:abstractNumId w:val="7"/>
   </w:num>
   <w:num w:numId="3" w16cid:durableId="435172547">
     <w:abstractNumId w:val="4"/>
@@ -1596,6 +1720,9 @@
   </w:num>
   <w:num w:numId="7" w16cid:durableId="452990242">
     <w:abstractNumId w:val="1"/>
+  </w:num>
+  <w:num w:numId="8" w16cid:durableId="1070613449">
+    <w:abstractNumId w:val="6"/>
   </w:num>
 </w:numbering>
 </file>

</xml_diff>

<commit_message>
Pair programming record change
</commit_message>
<xml_diff>
--- a/Docs/Pair_Programming_record.docx
+++ b/Docs/Pair_Programming_record.docx
@@ -438,25 +438,48 @@
           <w:tcPr>
             <w:tcW w:w="1838" w:type="dxa"/>
           </w:tcPr>
-          <w:p/>
+          <w:p>
+            <w:r>
+              <w:t>16/10/26</w:t>
+            </w:r>
+            <w:r>
+              <w:t xml:space="preserve"> (16:15-18:00)</w:t>
+            </w:r>
+          </w:p>
         </w:tc>
         <w:tc>
           <w:tcPr>
             <w:tcW w:w="1134" w:type="dxa"/>
           </w:tcPr>
-          <w:p/>
+          <w:p>
+            <w:r>
+              <w:t>Piran Trevenna</w:t>
+            </w:r>
+          </w:p>
         </w:tc>
         <w:tc>
           <w:tcPr>
             <w:tcW w:w="1276" w:type="dxa"/>
           </w:tcPr>
-          <w:p/>
+          <w:p>
+            <w:r>
+              <w:t>Joshua Sewell</w:t>
+            </w:r>
+          </w:p>
         </w:tc>
         <w:tc>
           <w:tcPr>
             <w:tcW w:w="4768" w:type="dxa"/>
           </w:tcPr>
-          <w:p/>
+          <w:p>
+            <w:pPr>
+              <w:pStyle w:val="ListParagraph"/>
+              <w:numPr>
+                <w:ilvl w:val="0"/>
+                <w:numId w:val="9"/>
+              </w:numPr>
+            </w:pPr>
+          </w:p>
         </w:tc>
       </w:tr>
       <w:tr>
@@ -942,6 +965,95 @@
 <file path=word/numbering.xml><?xml version="1.0" encoding="utf-8"?>
 <w:numbering xmlns:wpc="http://schemas.microsoft.com/office/word/2010/wordprocessingCanvas" xmlns:cx="http://schemas.microsoft.com/office/drawing/2014/chartex" xmlns:cx1="http://schemas.microsoft.com/office/drawing/2015/9/8/chartex" xmlns:cx2="http://schemas.microsoft.com/office/drawing/2015/10/21/chartex" xmlns:cx3="http://schemas.microsoft.com/office/drawing/2016/5/9/chartex" xmlns:cx4="http://schemas.microsoft.com/office/drawing/2016/5/10/chartex" xmlns:cx5="http://schemas.microsoft.com/office/drawing/2016/5/11/chartex" xmlns:cx6="http://schemas.microsoft.com/office/drawing/2016/5/12/chartex" xmlns:cx7="http://schemas.microsoft.com/office/drawing/2016/5/13/chartex" xmlns:cx8="http://schemas.microsoft.com/office/drawing/2016/5/14/chartex" xmlns:mc="http://schemas.openxmlformats.org/markup-compatibility/2006" xmlns:aink="http://schemas.microsoft.com/office/drawing/2016/ink" xmlns:am3d="http://schemas.microsoft.com/office/drawing/2017/model3d" xmlns:o="urn:schemas-microsoft-com:office:office" xmlns:oel="http://schemas.microsoft.com/office/2019/extlst" xmlns:r="http://schemas.openxmlformats.org/officeDocument/2006/relationships" xmlns:m="http://schemas.openxmlformats.org/officeDocument/2006/math" xmlns:v="urn:schemas-microsoft-com:vml" xmlns:wp14="http://schemas.microsoft.com/office/word/2010/wordprocessingDrawing" xmlns:wp="http://schemas.openxmlformats.org/drawingml/2006/wordprocessingDrawing" xmlns:w10="urn:schemas-microsoft-com:office:word" xmlns:w="http://schemas.openxmlformats.org/wordprocessingml/2006/main" xmlns:w14="http://schemas.microsoft.com/office/word/2010/wordml" xmlns:w15="http://schemas.microsoft.com/office/word/2012/wordml" xmlns:w16cex="http://schemas.microsoft.com/office/word/2018/wordml/cex" xmlns:w16cid="http://schemas.microsoft.com/office/word/2016/wordml/cid" xmlns:w16="http://schemas.microsoft.com/office/word/2018/wordml" xmlns:w16du="http://schemas.microsoft.com/office/word/2023/wordml/word16du" xmlns:w16sdtdh="http://schemas.microsoft.com/office/word/2020/wordml/sdtdatahash" xmlns:w16sdtfl="http://schemas.microsoft.com/office/word/2024/wordml/sdtformatlock" xmlns:w16se="http://schemas.microsoft.com/office/word/2015/wordml/symex" xmlns:wpg="http://schemas.microsoft.com/office/word/2010/wordprocessingGroup" xmlns:wpi="http://schemas.microsoft.com/office/word/2010/wordprocessingInk" xmlns:wne="http://schemas.microsoft.com/office/word/2006/wordml" xmlns:wps="http://schemas.microsoft.com/office/word/2010/wordprocessingShape" mc:Ignorable="w14 w15 w16se w16cid w16 w16cex w16sdtdh w16sdtfl w16du wp14">
   <w:abstractNum w:abstractNumId="0" w15:restartNumberingAfterBreak="0">
+    <w:nsid w:val="12601277"/>
+    <w:multiLevelType w:val="hybridMultilevel"/>
+    <w:tmpl w:val="F4C4B53C"/>
+    <w:lvl w:ilvl="0" w:tplc="0809000F">
+      <w:start w:val="1"/>
+      <w:numFmt w:val="decimal"/>
+      <w:lvlText w:val="%1."/>
+      <w:lvlJc w:val="left"/>
+      <w:pPr>
+        <w:ind w:left="720" w:hanging="360"/>
+      </w:pPr>
+      <w:rPr>
+        <w:rFonts w:hint="default"/>
+      </w:rPr>
+    </w:lvl>
+    <w:lvl w:ilvl="1" w:tplc="08090019" w:tentative="1">
+      <w:start w:val="1"/>
+      <w:numFmt w:val="lowerLetter"/>
+      <w:lvlText w:val="%2."/>
+      <w:lvlJc w:val="left"/>
+      <w:pPr>
+        <w:ind w:left="1440" w:hanging="360"/>
+      </w:pPr>
+    </w:lvl>
+    <w:lvl w:ilvl="2" w:tplc="0809001B" w:tentative="1">
+      <w:start w:val="1"/>
+      <w:numFmt w:val="lowerRoman"/>
+      <w:lvlText w:val="%3."/>
+      <w:lvlJc w:val="right"/>
+      <w:pPr>
+        <w:ind w:left="2160" w:hanging="180"/>
+      </w:pPr>
+    </w:lvl>
+    <w:lvl w:ilvl="3" w:tplc="0809000F" w:tentative="1">
+      <w:start w:val="1"/>
+      <w:numFmt w:val="decimal"/>
+      <w:lvlText w:val="%4."/>
+      <w:lvlJc w:val="left"/>
+      <w:pPr>
+        <w:ind w:left="2880" w:hanging="360"/>
+      </w:pPr>
+    </w:lvl>
+    <w:lvl w:ilvl="4" w:tplc="08090019" w:tentative="1">
+      <w:start w:val="1"/>
+      <w:numFmt w:val="lowerLetter"/>
+      <w:lvlText w:val="%5."/>
+      <w:lvlJc w:val="left"/>
+      <w:pPr>
+        <w:ind w:left="3600" w:hanging="360"/>
+      </w:pPr>
+    </w:lvl>
+    <w:lvl w:ilvl="5" w:tplc="0809001B" w:tentative="1">
+      <w:start w:val="1"/>
+      <w:numFmt w:val="lowerRoman"/>
+      <w:lvlText w:val="%6."/>
+      <w:lvlJc w:val="right"/>
+      <w:pPr>
+        <w:ind w:left="4320" w:hanging="180"/>
+      </w:pPr>
+    </w:lvl>
+    <w:lvl w:ilvl="6" w:tplc="0809000F" w:tentative="1">
+      <w:start w:val="1"/>
+      <w:numFmt w:val="decimal"/>
+      <w:lvlText w:val="%7."/>
+      <w:lvlJc w:val="left"/>
+      <w:pPr>
+        <w:ind w:left="5040" w:hanging="360"/>
+      </w:pPr>
+    </w:lvl>
+    <w:lvl w:ilvl="7" w:tplc="08090019" w:tentative="1">
+      <w:start w:val="1"/>
+      <w:numFmt w:val="lowerLetter"/>
+      <w:lvlText w:val="%8."/>
+      <w:lvlJc w:val="left"/>
+      <w:pPr>
+        <w:ind w:left="5760" w:hanging="360"/>
+      </w:pPr>
+    </w:lvl>
+    <w:lvl w:ilvl="8" w:tplc="0809001B" w:tentative="1">
+      <w:start w:val="1"/>
+      <w:numFmt w:val="lowerRoman"/>
+      <w:lvlText w:val="%9."/>
+      <w:lvlJc w:val="right"/>
+      <w:pPr>
+        <w:ind w:left="6480" w:hanging="180"/>
+      </w:pPr>
+    </w:lvl>
+  </w:abstractNum>
+  <w:abstractNum w:abstractNumId="1" w15:restartNumberingAfterBreak="0">
     <w:nsid w:val="20836751"/>
     <w:multiLevelType w:val="hybridMultilevel"/>
     <w:tmpl w:val="2E0E1E7C"/>
@@ -1053,7 +1165,7 @@
       </w:rPr>
     </w:lvl>
   </w:abstractNum>
-  <w:abstractNum w:abstractNumId="1" w15:restartNumberingAfterBreak="0">
+  <w:abstractNum w:abstractNumId="2" w15:restartNumberingAfterBreak="0">
     <w:nsid w:val="3A940F1B"/>
     <w:multiLevelType w:val="hybridMultilevel"/>
     <w:tmpl w:val="CCAC563C"/>
@@ -1142,7 +1254,7 @@
       </w:pPr>
     </w:lvl>
   </w:abstractNum>
-  <w:abstractNum w:abstractNumId="2" w15:restartNumberingAfterBreak="0">
+  <w:abstractNum w:abstractNumId="3" w15:restartNumberingAfterBreak="0">
     <w:nsid w:val="438576B6"/>
     <w:multiLevelType w:val="hybridMultilevel"/>
     <w:tmpl w:val="3494A2AE"/>
@@ -1231,7 +1343,7 @@
       </w:pPr>
     </w:lvl>
   </w:abstractNum>
-  <w:abstractNum w:abstractNumId="3" w15:restartNumberingAfterBreak="0">
+  <w:abstractNum w:abstractNumId="4" w15:restartNumberingAfterBreak="0">
     <w:nsid w:val="45E47A02"/>
     <w:multiLevelType w:val="hybridMultilevel"/>
     <w:tmpl w:val="C78E3E8E"/>
@@ -1344,7 +1456,7 @@
       </w:rPr>
     </w:lvl>
   </w:abstractNum>
-  <w:abstractNum w:abstractNumId="4" w15:restartNumberingAfterBreak="0">
+  <w:abstractNum w:abstractNumId="5" w15:restartNumberingAfterBreak="0">
     <w:nsid w:val="4CC8647F"/>
     <w:multiLevelType w:val="hybridMultilevel"/>
     <w:tmpl w:val="93C6BE94"/>
@@ -1433,7 +1545,7 @@
       </w:pPr>
     </w:lvl>
   </w:abstractNum>
-  <w:abstractNum w:abstractNumId="5" w15:restartNumberingAfterBreak="0">
+  <w:abstractNum w:abstractNumId="6" w15:restartNumberingAfterBreak="0">
     <w:nsid w:val="51B6788D"/>
     <w:multiLevelType w:val="hybridMultilevel"/>
     <w:tmpl w:val="70A6EADC"/>
@@ -1522,7 +1634,7 @@
       </w:pPr>
     </w:lvl>
   </w:abstractNum>
-  <w:abstractNum w:abstractNumId="6" w15:restartNumberingAfterBreak="0">
+  <w:abstractNum w:abstractNumId="7" w15:restartNumberingAfterBreak="0">
     <w:nsid w:val="66E65A69"/>
     <w:multiLevelType w:val="hybridMultilevel"/>
     <w:tmpl w:val="83E097AC"/>
@@ -1611,7 +1723,7 @@
       </w:pPr>
     </w:lvl>
   </w:abstractNum>
-  <w:abstractNum w:abstractNumId="7" w15:restartNumberingAfterBreak="0">
+  <w:abstractNum w:abstractNumId="8" w15:restartNumberingAfterBreak="0">
     <w:nsid w:val="7C896FF8"/>
     <w:multiLevelType w:val="hybridMultilevel"/>
     <w:tmpl w:val="0CC8ADF8"/>
@@ -1701,28 +1813,31 @@
     </w:lvl>
   </w:abstractNum>
   <w:num w:numId="1" w16cid:durableId="385642863">
+    <w:abstractNumId w:val="4"/>
+  </w:num>
+  <w:num w:numId="2" w16cid:durableId="665088174">
+    <w:abstractNumId w:val="8"/>
+  </w:num>
+  <w:num w:numId="3" w16cid:durableId="435172547">
+    <w:abstractNumId w:val="5"/>
+  </w:num>
+  <w:num w:numId="4" w16cid:durableId="205796072">
+    <w:abstractNumId w:val="1"/>
+  </w:num>
+  <w:num w:numId="5" w16cid:durableId="519440871">
     <w:abstractNumId w:val="3"/>
   </w:num>
-  <w:num w:numId="2" w16cid:durableId="665088174">
+  <w:num w:numId="6" w16cid:durableId="112749846">
+    <w:abstractNumId w:val="6"/>
+  </w:num>
+  <w:num w:numId="7" w16cid:durableId="452990242">
+    <w:abstractNumId w:val="2"/>
+  </w:num>
+  <w:num w:numId="8" w16cid:durableId="1070613449">
     <w:abstractNumId w:val="7"/>
   </w:num>
-  <w:num w:numId="3" w16cid:durableId="435172547">
-    <w:abstractNumId w:val="4"/>
-  </w:num>
-  <w:num w:numId="4" w16cid:durableId="205796072">
+  <w:num w:numId="9" w16cid:durableId="1045716424">
     <w:abstractNumId w:val="0"/>
-  </w:num>
-  <w:num w:numId="5" w16cid:durableId="519440871">
-    <w:abstractNumId w:val="2"/>
-  </w:num>
-  <w:num w:numId="6" w16cid:durableId="112749846">
-    <w:abstractNumId w:val="5"/>
-  </w:num>
-  <w:num w:numId="7" w16cid:durableId="452990242">
-    <w:abstractNumId w:val="1"/>
-  </w:num>
-  <w:num w:numId="8" w16cid:durableId="1070613449">
-    <w:abstractNumId w:val="6"/>
   </w:num>
 </w:numbering>
 </file>
@@ -2330,6 +2445,7 @@
   <w:style w:type="character" w:default="1" w:styleId="DefaultParagraphFont">
     <w:name w:val="Default Paragraph Font"/>
     <w:uiPriority w:val="1"/>
+    <w:semiHidden/>
     <w:unhideWhenUsed/>
   </w:style>
   <w:style w:type="table" w:default="1" w:styleId="TableNormal">

</xml_diff>

<commit_message>
Completed file logging functionality for players and decks
</commit_message>
<xml_diff>
--- a/Docs/Pair_Programming_record.docx
+++ b/Docs/Pair_Programming_record.docx
@@ -479,6 +479,12 @@
                 <w:numId w:val="9"/>
               </w:numPr>
             </w:pPr>
+            <w:r>
+              <w:t>dd56a92</w:t>
+            </w:r>
+            <w:r>
+              <w:t xml:space="preserve"> – Added log file writing method to the player.</w:t>
+            </w:r>
           </w:p>
         </w:tc>
       </w:tr>

</xml_diff>

<commit_message>
Drafted rationale report and made minor changes to tests and Player class
</commit_message>
<xml_diff>
--- a/Docs/Pair_Programming_record.docx
+++ b/Docs/Pair_Programming_record.docx
@@ -53,6 +53,15 @@
             <w:r>
               <w:t>Significant commits</w:t>
             </w:r>
+            <w:r>
+              <w:t xml:space="preserve"> (Identifier – </w:t>
+            </w:r>
+            <w:r>
+              <w:t>Description</w:t>
+            </w:r>
+            <w:r>
+              <w:t>)</w:t>
+            </w:r>
           </w:p>
         </w:tc>
       </w:tr>
@@ -697,51 +706,69 @@
           <w:tcPr>
             <w:tcW w:w="1838" w:type="dxa"/>
           </w:tcPr>
-          <w:p/>
+          <w:p>
+            <w:r>
+              <w:t>19/10/26 (14:30-16:30)</w:t>
+            </w:r>
+          </w:p>
         </w:tc>
         <w:tc>
           <w:tcPr>
             <w:tcW w:w="1134" w:type="dxa"/>
           </w:tcPr>
-          <w:p/>
+          <w:p>
+            <w:r>
+              <w:t>Piran Trevenna</w:t>
+            </w:r>
+          </w:p>
         </w:tc>
         <w:tc>
           <w:tcPr>
             <w:tcW w:w="1276" w:type="dxa"/>
           </w:tcPr>
-          <w:p/>
+          <w:p>
+            <w:r>
+              <w:t>Joshua Sewell</w:t>
+            </w:r>
+          </w:p>
         </w:tc>
         <w:tc>
           <w:tcPr>
             <w:tcW w:w="4768" w:type="dxa"/>
           </w:tcPr>
-          <w:p/>
-        </w:tc>
-      </w:tr>
-      <w:tr>
-        <w:tc>
-          <w:tcPr>
-            <w:tcW w:w="1838" w:type="dxa"/>
-          </w:tcPr>
-          <w:p/>
-        </w:tc>
-        <w:tc>
-          <w:tcPr>
-            <w:tcW w:w="1134" w:type="dxa"/>
-          </w:tcPr>
-          <w:p/>
-        </w:tc>
-        <w:tc>
-          <w:tcPr>
-            <w:tcW w:w="1276" w:type="dxa"/>
-          </w:tcPr>
-          <w:p/>
-        </w:tc>
-        <w:tc>
-          <w:tcPr>
-            <w:tcW w:w="4768" w:type="dxa"/>
-          </w:tcPr>
-          <w:p/>
+          <w:p>
+            <w:pPr>
+              <w:pStyle w:val="ListParagraph"/>
+              <w:numPr>
+                <w:ilvl w:val="0"/>
+                <w:numId w:val="13"/>
+              </w:numPr>
+            </w:pPr>
+            <w:r>
+              <w:t>– Documentation writing.</w:t>
+            </w:r>
+          </w:p>
+          <w:p>
+            <w:pPr>
+              <w:pStyle w:val="ListParagraph"/>
+              <w:numPr>
+                <w:ilvl w:val="0"/>
+                <w:numId w:val="13"/>
+              </w:numPr>
+            </w:pPr>
+            <w:r>
+              <w:t>– Implemented more integration tests</w:t>
+            </w:r>
+            <w:r>
+              <w:t xml:space="preserve"> for input</w:t>
+            </w:r>
+            <w:r>
+              <w:t>s</w:t>
+            </w:r>
+            <w:r>
+              <w:t>/outputs.</w:t>
+            </w:r>
+          </w:p>
         </w:tc>
       </w:tr>
       <w:tr>
@@ -1387,6 +1414,95 @@
     </w:lvl>
   </w:abstractNum>
   <w:abstractNum w:abstractNumId="3" w15:restartNumberingAfterBreak="0">
+    <w:nsid w:val="2D2A5264"/>
+    <w:multiLevelType w:val="hybridMultilevel"/>
+    <w:tmpl w:val="0DA0FF84"/>
+    <w:lvl w:ilvl="0" w:tplc="0809000F">
+      <w:start w:val="1"/>
+      <w:numFmt w:val="decimal"/>
+      <w:lvlText w:val="%1."/>
+      <w:lvlJc w:val="left"/>
+      <w:pPr>
+        <w:ind w:left="720" w:hanging="360"/>
+      </w:pPr>
+      <w:rPr>
+        <w:rFonts w:hint="default"/>
+      </w:rPr>
+    </w:lvl>
+    <w:lvl w:ilvl="1" w:tplc="08090019" w:tentative="1">
+      <w:start w:val="1"/>
+      <w:numFmt w:val="lowerLetter"/>
+      <w:lvlText w:val="%2."/>
+      <w:lvlJc w:val="left"/>
+      <w:pPr>
+        <w:ind w:left="1440" w:hanging="360"/>
+      </w:pPr>
+    </w:lvl>
+    <w:lvl w:ilvl="2" w:tplc="0809001B" w:tentative="1">
+      <w:start w:val="1"/>
+      <w:numFmt w:val="lowerRoman"/>
+      <w:lvlText w:val="%3."/>
+      <w:lvlJc w:val="right"/>
+      <w:pPr>
+        <w:ind w:left="2160" w:hanging="180"/>
+      </w:pPr>
+    </w:lvl>
+    <w:lvl w:ilvl="3" w:tplc="0809000F" w:tentative="1">
+      <w:start w:val="1"/>
+      <w:numFmt w:val="decimal"/>
+      <w:lvlText w:val="%4."/>
+      <w:lvlJc w:val="left"/>
+      <w:pPr>
+        <w:ind w:left="2880" w:hanging="360"/>
+      </w:pPr>
+    </w:lvl>
+    <w:lvl w:ilvl="4" w:tplc="08090019" w:tentative="1">
+      <w:start w:val="1"/>
+      <w:numFmt w:val="lowerLetter"/>
+      <w:lvlText w:val="%5."/>
+      <w:lvlJc w:val="left"/>
+      <w:pPr>
+        <w:ind w:left="3600" w:hanging="360"/>
+      </w:pPr>
+    </w:lvl>
+    <w:lvl w:ilvl="5" w:tplc="0809001B" w:tentative="1">
+      <w:start w:val="1"/>
+      <w:numFmt w:val="lowerRoman"/>
+      <w:lvlText w:val="%6."/>
+      <w:lvlJc w:val="right"/>
+      <w:pPr>
+        <w:ind w:left="4320" w:hanging="180"/>
+      </w:pPr>
+    </w:lvl>
+    <w:lvl w:ilvl="6" w:tplc="0809000F" w:tentative="1">
+      <w:start w:val="1"/>
+      <w:numFmt w:val="decimal"/>
+      <w:lvlText w:val="%7."/>
+      <w:lvlJc w:val="left"/>
+      <w:pPr>
+        <w:ind w:left="5040" w:hanging="360"/>
+      </w:pPr>
+    </w:lvl>
+    <w:lvl w:ilvl="7" w:tplc="08090019" w:tentative="1">
+      <w:start w:val="1"/>
+      <w:numFmt w:val="lowerLetter"/>
+      <w:lvlText w:val="%8."/>
+      <w:lvlJc w:val="left"/>
+      <w:pPr>
+        <w:ind w:left="5760" w:hanging="360"/>
+      </w:pPr>
+    </w:lvl>
+    <w:lvl w:ilvl="8" w:tplc="0809001B" w:tentative="1">
+      <w:start w:val="1"/>
+      <w:numFmt w:val="lowerRoman"/>
+      <w:lvlText w:val="%9."/>
+      <w:lvlJc w:val="right"/>
+      <w:pPr>
+        <w:ind w:left="6480" w:hanging="180"/>
+      </w:pPr>
+    </w:lvl>
+  </w:abstractNum>
+  <w:abstractNum w:abstractNumId="4" w15:restartNumberingAfterBreak="0">
     <w:nsid w:val="3A940F1B"/>
     <w:multiLevelType w:val="hybridMultilevel"/>
     <w:tmpl w:val="CCAC563C"/>
@@ -1475,7 +1591,7 @@
       </w:pPr>
     </w:lvl>
   </w:abstractNum>
-  <w:abstractNum w:abstractNumId="4" w15:restartNumberingAfterBreak="0">
+  <w:abstractNum w:abstractNumId="5" w15:restartNumberingAfterBreak="0">
     <w:nsid w:val="438576B6"/>
     <w:multiLevelType w:val="hybridMultilevel"/>
     <w:tmpl w:val="3494A2AE"/>
@@ -1564,7 +1680,7 @@
       </w:pPr>
     </w:lvl>
   </w:abstractNum>
-  <w:abstractNum w:abstractNumId="5" w15:restartNumberingAfterBreak="0">
+  <w:abstractNum w:abstractNumId="6" w15:restartNumberingAfterBreak="0">
     <w:nsid w:val="45E47A02"/>
     <w:multiLevelType w:val="hybridMultilevel"/>
     <w:tmpl w:val="C78E3E8E"/>
@@ -1677,7 +1793,7 @@
       </w:rPr>
     </w:lvl>
   </w:abstractNum>
-  <w:abstractNum w:abstractNumId="6" w15:restartNumberingAfterBreak="0">
+  <w:abstractNum w:abstractNumId="7" w15:restartNumberingAfterBreak="0">
     <w:nsid w:val="4C24355D"/>
     <w:multiLevelType w:val="hybridMultilevel"/>
     <w:tmpl w:val="52144EAA"/>
@@ -1766,7 +1882,7 @@
       </w:pPr>
     </w:lvl>
   </w:abstractNum>
-  <w:abstractNum w:abstractNumId="7" w15:restartNumberingAfterBreak="0">
+  <w:abstractNum w:abstractNumId="8" w15:restartNumberingAfterBreak="0">
     <w:nsid w:val="4C2F73F1"/>
     <w:multiLevelType w:val="hybridMultilevel"/>
     <w:tmpl w:val="1FB005AC"/>
@@ -1855,7 +1971,7 @@
       </w:pPr>
     </w:lvl>
   </w:abstractNum>
-  <w:abstractNum w:abstractNumId="8" w15:restartNumberingAfterBreak="0">
+  <w:abstractNum w:abstractNumId="9" w15:restartNumberingAfterBreak="0">
     <w:nsid w:val="4CC8647F"/>
     <w:multiLevelType w:val="hybridMultilevel"/>
     <w:tmpl w:val="93C6BE94"/>
@@ -1944,7 +2060,7 @@
       </w:pPr>
     </w:lvl>
   </w:abstractNum>
-  <w:abstractNum w:abstractNumId="9" w15:restartNumberingAfterBreak="0">
+  <w:abstractNum w:abstractNumId="10" w15:restartNumberingAfterBreak="0">
     <w:nsid w:val="51B6788D"/>
     <w:multiLevelType w:val="hybridMultilevel"/>
     <w:tmpl w:val="70A6EADC"/>
@@ -2033,7 +2149,7 @@
       </w:pPr>
     </w:lvl>
   </w:abstractNum>
-  <w:abstractNum w:abstractNumId="10" w15:restartNumberingAfterBreak="0">
+  <w:abstractNum w:abstractNumId="11" w15:restartNumberingAfterBreak="0">
     <w:nsid w:val="66E65A69"/>
     <w:multiLevelType w:val="hybridMultilevel"/>
     <w:tmpl w:val="83E097AC"/>
@@ -2122,7 +2238,7 @@
       </w:pPr>
     </w:lvl>
   </w:abstractNum>
-  <w:abstractNum w:abstractNumId="11" w15:restartNumberingAfterBreak="0">
+  <w:abstractNum w:abstractNumId="12" w15:restartNumberingAfterBreak="0">
     <w:nsid w:val="7C896FF8"/>
     <w:multiLevelType w:val="hybridMultilevel"/>
     <w:tmpl w:val="0CC8ADF8"/>
@@ -2212,40 +2328,43 @@
     </w:lvl>
   </w:abstractNum>
   <w:num w:numId="1" w16cid:durableId="385642863">
-    <w:abstractNumId w:val="5"/>
+    <w:abstractNumId w:val="6"/>
   </w:num>
   <w:num w:numId="2" w16cid:durableId="665088174">
-    <w:abstractNumId w:val="11"/>
+    <w:abstractNumId w:val="12"/>
   </w:num>
   <w:num w:numId="3" w16cid:durableId="435172547">
-    <w:abstractNumId w:val="8"/>
+    <w:abstractNumId w:val="9"/>
   </w:num>
   <w:num w:numId="4" w16cid:durableId="205796072">
     <w:abstractNumId w:val="1"/>
   </w:num>
   <w:num w:numId="5" w16cid:durableId="519440871">
+    <w:abstractNumId w:val="5"/>
+  </w:num>
+  <w:num w:numId="6" w16cid:durableId="112749846">
+    <w:abstractNumId w:val="10"/>
+  </w:num>
+  <w:num w:numId="7" w16cid:durableId="452990242">
     <w:abstractNumId w:val="4"/>
   </w:num>
-  <w:num w:numId="6" w16cid:durableId="112749846">
-    <w:abstractNumId w:val="9"/>
-  </w:num>
-  <w:num w:numId="7" w16cid:durableId="452990242">
-    <w:abstractNumId w:val="3"/>
-  </w:num>
   <w:num w:numId="8" w16cid:durableId="1070613449">
-    <w:abstractNumId w:val="10"/>
+    <w:abstractNumId w:val="11"/>
   </w:num>
   <w:num w:numId="9" w16cid:durableId="1045716424">
     <w:abstractNumId w:val="0"/>
   </w:num>
   <w:num w:numId="10" w16cid:durableId="708918496">
-    <w:abstractNumId w:val="6"/>
+    <w:abstractNumId w:val="7"/>
   </w:num>
   <w:num w:numId="11" w16cid:durableId="930699933">
-    <w:abstractNumId w:val="7"/>
+    <w:abstractNumId w:val="8"/>
   </w:num>
   <w:num w:numId="12" w16cid:durableId="972322050">
     <w:abstractNumId w:val="2"/>
+  </w:num>
+  <w:num w:numId="13" w16cid:durableId="1156191506">
+    <w:abstractNumId w:val="3"/>
   </w:num>
 </w:numbering>
 </file>
@@ -2853,6 +2972,7 @@
   <w:style w:type="character" w:default="1" w:styleId="DefaultParagraphFont">
     <w:name w:val="Default Paragraph Font"/>
     <w:uiPriority w:val="1"/>
+    <w:semiHidden/>
     <w:unhideWhenUsed/>
   </w:style>
   <w:style w:type="table" w:default="1" w:styleId="TableNormal">

</xml_diff>

<commit_message>
Fixed test bug where sorting was non-deterministic, switched to checking if elist contains elements instead of list = otherList
</commit_message>
<xml_diff>
--- a/Docs/Pair_Programming_record.docx
+++ b/Docs/Pair_Programming_record.docx
@@ -744,6 +744,12 @@
                 <w:numId w:val="13"/>
               </w:numPr>
             </w:pPr>
+            <w:r>
+              <w:t>0fabb6f</w:t>
+            </w:r>
+            <w:r>
+              <w:t xml:space="preserve"> </w:t>
+            </w:r>
             <w:r>
               <w:t>– Documentation writing.</w:t>
             </w:r>

</xml_diff>

<commit_message>
Updated README, fixed tests not cleaning up files properly, updated documentation
</commit_message>
<xml_diff>
--- a/Docs/Pair_Programming_record.docx
+++ b/Docs/Pair_Programming_record.docx
@@ -778,7 +778,7 @@
           </w:tcPr>
           <w:p>
             <w:r>
-              <w:t>19/10/26 (17:40-18:30)</w:t>
+              <w:t>19/10/26 (22:00) – 20/10/26 (02:00)</w:t>
             </w:r>
           </w:p>
         </w:tc>
@@ -811,9 +811,72 @@
               <w:pStyle w:val="ListParagraph"/>
               <w:numPr>
                 <w:ilvl w:val="0"/>
-                <w:numId w:val="14"/>
+                <w:numId w:val="16"/>
               </w:numPr>
             </w:pPr>
+            <w:r>
+              <w:t>0ed869e</w:t>
+            </w:r>
+            <w:r>
+              <w:t xml:space="preserve"> – Made .jar file, and fixed file writing bugs in tests. </w:t>
+            </w:r>
+          </w:p>
+          <w:p>
+            <w:pPr>
+              <w:pStyle w:val="ListParagraph"/>
+              <w:numPr>
+                <w:ilvl w:val="0"/>
+                <w:numId w:val="16"/>
+              </w:numPr>
+            </w:pPr>
+            <w:r>
+              <w:t>a2edb9c</w:t>
+            </w:r>
+            <w:r>
+              <w:t xml:space="preserve"> – Added tests for output files</w:t>
+            </w:r>
+            <w:r>
+              <w:t>.</w:t>
+            </w:r>
+          </w:p>
+          <w:p>
+            <w:pPr>
+              <w:pStyle w:val="ListParagraph"/>
+              <w:numPr>
+                <w:ilvl w:val="0"/>
+                <w:numId w:val="16"/>
+              </w:numPr>
+            </w:pPr>
+            <w:r>
+              <w:t>2a22e4b</w:t>
+            </w:r>
+            <w:r>
+              <w:t xml:space="preserve"> – Fixed issues with </w:t>
+            </w:r>
+            <w:r>
+              <w:t>integration tests not resetting players and decks.</w:t>
+            </w:r>
+          </w:p>
+          <w:p>
+            <w:pPr>
+              <w:pStyle w:val="ListParagraph"/>
+              <w:numPr>
+                <w:ilvl w:val="0"/>
+                <w:numId w:val="16"/>
+              </w:numPr>
+            </w:pPr>
+            <w:r>
+              <w:t>4c0d3b9</w:t>
+            </w:r>
+            <w:r>
+              <w:t xml:space="preserve"> – Fixed issues with not resetting the player count </w:t>
+            </w:r>
+            <w:r>
+              <w:t>correctly</w:t>
+            </w:r>
+            <w:r>
+              <w:t>.</w:t>
+            </w:r>
           </w:p>
         </w:tc>
       </w:tr>
@@ -822,185 +885,64 @@
           <w:tcPr>
             <w:tcW w:w="1838" w:type="dxa"/>
           </w:tcPr>
-          <w:p/>
+          <w:p>
+            <w:r>
+              <w:t>20/10/26 02:00</w:t>
+            </w:r>
+          </w:p>
         </w:tc>
         <w:tc>
           <w:tcPr>
             <w:tcW w:w="1134" w:type="dxa"/>
           </w:tcPr>
-          <w:p/>
+          <w:p>
+            <w:r>
+              <w:t>N/A</w:t>
+            </w:r>
+          </w:p>
         </w:tc>
         <w:tc>
           <w:tcPr>
             <w:tcW w:w="1276" w:type="dxa"/>
           </w:tcPr>
-          <w:p/>
+          <w:p>
+            <w:r>
+              <w:t>N/A</w:t>
+            </w:r>
+          </w:p>
         </w:tc>
         <w:tc>
           <w:tcPr>
             <w:tcW w:w="4768" w:type="dxa"/>
           </w:tcPr>
-          <w:p/>
-        </w:tc>
-      </w:tr>
-      <w:tr>
-        <w:tc>
-          <w:tcPr>
-            <w:tcW w:w="1838" w:type="dxa"/>
-          </w:tcPr>
-          <w:p/>
-        </w:tc>
-        <w:tc>
-          <w:tcPr>
-            <w:tcW w:w="1134" w:type="dxa"/>
-          </w:tcPr>
-          <w:p/>
-        </w:tc>
-        <w:tc>
-          <w:tcPr>
-            <w:tcW w:w="1276" w:type="dxa"/>
-          </w:tcPr>
-          <w:p/>
-        </w:tc>
-        <w:tc>
-          <w:tcPr>
-            <w:tcW w:w="4768" w:type="dxa"/>
-          </w:tcPr>
-          <w:p/>
-        </w:tc>
-      </w:tr>
-      <w:tr>
-        <w:tc>
-          <w:tcPr>
-            <w:tcW w:w="1838" w:type="dxa"/>
-          </w:tcPr>
-          <w:p/>
-        </w:tc>
-        <w:tc>
-          <w:tcPr>
-            <w:tcW w:w="1134" w:type="dxa"/>
-          </w:tcPr>
-          <w:p/>
-        </w:tc>
-        <w:tc>
-          <w:tcPr>
-            <w:tcW w:w="1276" w:type="dxa"/>
-          </w:tcPr>
-          <w:p/>
-        </w:tc>
-        <w:tc>
-          <w:tcPr>
-            <w:tcW w:w="4768" w:type="dxa"/>
-          </w:tcPr>
-          <w:p/>
-        </w:tc>
-      </w:tr>
-      <w:tr>
-        <w:tc>
-          <w:tcPr>
-            <w:tcW w:w="1838" w:type="dxa"/>
-          </w:tcPr>
-          <w:p/>
-        </w:tc>
-        <w:tc>
-          <w:tcPr>
-            <w:tcW w:w="1134" w:type="dxa"/>
-          </w:tcPr>
-          <w:p/>
-        </w:tc>
-        <w:tc>
-          <w:tcPr>
-            <w:tcW w:w="1276" w:type="dxa"/>
-          </w:tcPr>
-          <w:p/>
-        </w:tc>
-        <w:tc>
-          <w:tcPr>
-            <w:tcW w:w="4768" w:type="dxa"/>
-          </w:tcPr>
-          <w:p/>
-        </w:tc>
-      </w:tr>
-      <w:tr>
-        <w:tc>
-          <w:tcPr>
-            <w:tcW w:w="1838" w:type="dxa"/>
-          </w:tcPr>
-          <w:p/>
-        </w:tc>
-        <w:tc>
-          <w:tcPr>
-            <w:tcW w:w="1134" w:type="dxa"/>
-          </w:tcPr>
-          <w:p/>
-        </w:tc>
-        <w:tc>
-          <w:tcPr>
-            <w:tcW w:w="1276" w:type="dxa"/>
-          </w:tcPr>
-          <w:p/>
-        </w:tc>
-        <w:tc>
-          <w:tcPr>
-            <w:tcW w:w="4768" w:type="dxa"/>
-          </w:tcPr>
-          <w:p/>
-        </w:tc>
-      </w:tr>
-      <w:tr>
-        <w:tc>
-          <w:tcPr>
-            <w:tcW w:w="1838" w:type="dxa"/>
-          </w:tcPr>
-          <w:p/>
-        </w:tc>
-        <w:tc>
-          <w:tcPr>
-            <w:tcW w:w="1134" w:type="dxa"/>
-          </w:tcPr>
-          <w:p/>
-        </w:tc>
-        <w:tc>
-          <w:tcPr>
-            <w:tcW w:w="1276" w:type="dxa"/>
-          </w:tcPr>
-          <w:p/>
-        </w:tc>
-        <w:tc>
-          <w:tcPr>
-            <w:tcW w:w="4768" w:type="dxa"/>
-          </w:tcPr>
-          <w:p/>
-        </w:tc>
-      </w:tr>
-      <w:tr>
-        <w:tc>
-          <w:tcPr>
-            <w:tcW w:w="1838" w:type="dxa"/>
-          </w:tcPr>
-          <w:p/>
-        </w:tc>
-        <w:tc>
-          <w:tcPr>
-            <w:tcW w:w="1134" w:type="dxa"/>
-          </w:tcPr>
-          <w:p/>
-        </w:tc>
-        <w:tc>
-          <w:tcPr>
-            <w:tcW w:w="1276" w:type="dxa"/>
-          </w:tcPr>
-          <w:p/>
-        </w:tc>
-        <w:tc>
-          <w:tcPr>
-            <w:tcW w:w="4768" w:type="dxa"/>
-          </w:tcPr>
-          <w:p/>
+          <w:p>
+            <w:pPr>
+              <w:pStyle w:val="ListParagraph"/>
+              <w:numPr>
+                <w:ilvl w:val="0"/>
+                <w:numId w:val="17"/>
+              </w:numPr>
+            </w:pPr>
+            <w:r>
+              <w:t>– Final commit including submission.</w:t>
+            </w:r>
+          </w:p>
         </w:tc>
       </w:tr>
     </w:tbl>
-    <w:p/>
+    <w:p>
+      <w:r>
+        <w:t xml:space="preserve">GitHub repo link: </w:t>
+      </w:r>
+      <w:hyperlink r:id="rId5" w:history="1">
+        <w:r>
+          <w:rPr>
+            <w:rStyle w:val="Hyperlink"/>
+          </w:rPr>
+          <w:t>https://github.com/js1915/thread_cards</w:t>
+        </w:r>
+      </w:hyperlink>
+    </w:p>
     <w:sectPr>
       <w:pgSz w:w="11906" w:h="16838"/>
       <w:pgMar w:top="1440" w:right="1440" w:bottom="1440" w:left="1440" w:header="708" w:footer="708" w:gutter="0"/>
@@ -1014,6 +956,95 @@
 <file path=word/numbering.xml><?xml version="1.0" encoding="utf-8"?>
 <w:numbering xmlns:wpc="http://schemas.microsoft.com/office/word/2010/wordprocessingCanvas" xmlns:cx="http://schemas.microsoft.com/office/drawing/2014/chartex" xmlns:cx1="http://schemas.microsoft.com/office/drawing/2015/9/8/chartex" xmlns:cx2="http://schemas.microsoft.com/office/drawing/2015/10/21/chartex" xmlns:cx3="http://schemas.microsoft.com/office/drawing/2016/5/9/chartex" xmlns:cx4="http://schemas.microsoft.com/office/drawing/2016/5/10/chartex" xmlns:cx5="http://schemas.microsoft.com/office/drawing/2016/5/11/chartex" xmlns:cx6="http://schemas.microsoft.com/office/drawing/2016/5/12/chartex" xmlns:cx7="http://schemas.microsoft.com/office/drawing/2016/5/13/chartex" xmlns:cx8="http://schemas.microsoft.com/office/drawing/2016/5/14/chartex" xmlns:mc="http://schemas.openxmlformats.org/markup-compatibility/2006" xmlns:aink="http://schemas.microsoft.com/office/drawing/2016/ink" xmlns:am3d="http://schemas.microsoft.com/office/drawing/2017/model3d" xmlns:o="urn:schemas-microsoft-com:office:office" xmlns:oel="http://schemas.microsoft.com/office/2019/extlst" xmlns:r="http://schemas.openxmlformats.org/officeDocument/2006/relationships" xmlns:m="http://schemas.openxmlformats.org/officeDocument/2006/math" xmlns:v="urn:schemas-microsoft-com:vml" xmlns:wp14="http://schemas.microsoft.com/office/word/2010/wordprocessingDrawing" xmlns:wp="http://schemas.openxmlformats.org/drawingml/2006/wordprocessingDrawing" xmlns:w10="urn:schemas-microsoft-com:office:word" xmlns:w="http://schemas.openxmlformats.org/wordprocessingml/2006/main" xmlns:w14="http://schemas.microsoft.com/office/word/2010/wordml" xmlns:w15="http://schemas.microsoft.com/office/word/2012/wordml" xmlns:w16cex="http://schemas.microsoft.com/office/word/2018/wordml/cex" xmlns:w16cid="http://schemas.microsoft.com/office/word/2016/wordml/cid" xmlns:w16="http://schemas.microsoft.com/office/word/2018/wordml" xmlns:w16du="http://schemas.microsoft.com/office/word/2023/wordml/word16du" xmlns:w16sdtdh="http://schemas.microsoft.com/office/word/2020/wordml/sdtdatahash" xmlns:w16sdtfl="http://schemas.microsoft.com/office/word/2024/wordml/sdtformatlock" xmlns:w16se="http://schemas.microsoft.com/office/word/2015/wordml/symex" xmlns:wpg="http://schemas.microsoft.com/office/word/2010/wordprocessingGroup" xmlns:wpi="http://schemas.microsoft.com/office/word/2010/wordprocessingInk" xmlns:wne="http://schemas.microsoft.com/office/word/2006/wordml" xmlns:wps="http://schemas.microsoft.com/office/word/2010/wordprocessingShape" mc:Ignorable="w14 w15 w16se w16cid w16 w16cex w16sdtdh w16sdtfl w16du wp14">
   <w:abstractNum w:abstractNumId="0" w15:restartNumberingAfterBreak="0">
+    <w:nsid w:val="0E1624A4"/>
+    <w:multiLevelType w:val="hybridMultilevel"/>
+    <w:tmpl w:val="AD4A9956"/>
+    <w:lvl w:ilvl="0" w:tplc="0809000F">
+      <w:start w:val="1"/>
+      <w:numFmt w:val="decimal"/>
+      <w:lvlText w:val="%1."/>
+      <w:lvlJc w:val="left"/>
+      <w:pPr>
+        <w:ind w:left="720" w:hanging="360"/>
+      </w:pPr>
+      <w:rPr>
+        <w:rFonts w:hint="default"/>
+      </w:rPr>
+    </w:lvl>
+    <w:lvl w:ilvl="1" w:tplc="08090019" w:tentative="1">
+      <w:start w:val="1"/>
+      <w:numFmt w:val="lowerLetter"/>
+      <w:lvlText w:val="%2."/>
+      <w:lvlJc w:val="left"/>
+      <w:pPr>
+        <w:ind w:left="1440" w:hanging="360"/>
+      </w:pPr>
+    </w:lvl>
+    <w:lvl w:ilvl="2" w:tplc="0809001B" w:tentative="1">
+      <w:start w:val="1"/>
+      <w:numFmt w:val="lowerRoman"/>
+      <w:lvlText w:val="%3."/>
+      <w:lvlJc w:val="right"/>
+      <w:pPr>
+        <w:ind w:left="2160" w:hanging="180"/>
+      </w:pPr>
+    </w:lvl>
+    <w:lvl w:ilvl="3" w:tplc="0809000F" w:tentative="1">
+      <w:start w:val="1"/>
+      <w:numFmt w:val="decimal"/>
+      <w:lvlText w:val="%4."/>
+      <w:lvlJc w:val="left"/>
+      <w:pPr>
+        <w:ind w:left="2880" w:hanging="360"/>
+      </w:pPr>
+    </w:lvl>
+    <w:lvl w:ilvl="4" w:tplc="08090019" w:tentative="1">
+      <w:start w:val="1"/>
+      <w:numFmt w:val="lowerLetter"/>
+      <w:lvlText w:val="%5."/>
+      <w:lvlJc w:val="left"/>
+      <w:pPr>
+        <w:ind w:left="3600" w:hanging="360"/>
+      </w:pPr>
+    </w:lvl>
+    <w:lvl w:ilvl="5" w:tplc="0809001B" w:tentative="1">
+      <w:start w:val="1"/>
+      <w:numFmt w:val="lowerRoman"/>
+      <w:lvlText w:val="%6."/>
+      <w:lvlJc w:val="right"/>
+      <w:pPr>
+        <w:ind w:left="4320" w:hanging="180"/>
+      </w:pPr>
+    </w:lvl>
+    <w:lvl w:ilvl="6" w:tplc="0809000F" w:tentative="1">
+      <w:start w:val="1"/>
+      <w:numFmt w:val="decimal"/>
+      <w:lvlText w:val="%7."/>
+      <w:lvlJc w:val="left"/>
+      <w:pPr>
+        <w:ind w:left="5040" w:hanging="360"/>
+      </w:pPr>
+    </w:lvl>
+    <w:lvl w:ilvl="7" w:tplc="08090019" w:tentative="1">
+      <w:start w:val="1"/>
+      <w:numFmt w:val="lowerLetter"/>
+      <w:lvlText w:val="%8."/>
+      <w:lvlJc w:val="left"/>
+      <w:pPr>
+        <w:ind w:left="5760" w:hanging="360"/>
+      </w:pPr>
+    </w:lvl>
+    <w:lvl w:ilvl="8" w:tplc="0809001B" w:tentative="1">
+      <w:start w:val="1"/>
+      <w:numFmt w:val="lowerRoman"/>
+      <w:lvlText w:val="%9."/>
+      <w:lvlJc w:val="right"/>
+      <w:pPr>
+        <w:ind w:left="6480" w:hanging="180"/>
+      </w:pPr>
+    </w:lvl>
+  </w:abstractNum>
+  <w:abstractNum w:abstractNumId="1" w15:restartNumberingAfterBreak="0">
     <w:nsid w:val="12601277"/>
     <w:multiLevelType w:val="hybridMultilevel"/>
     <w:tmpl w:val="F4C4B53C"/>
@@ -1102,7 +1133,7 @@
       </w:pPr>
     </w:lvl>
   </w:abstractNum>
-  <w:abstractNum w:abstractNumId="1" w15:restartNumberingAfterBreak="0">
+  <w:abstractNum w:abstractNumId="2" w15:restartNumberingAfterBreak="0">
     <w:nsid w:val="20836751"/>
     <w:multiLevelType w:val="hybridMultilevel"/>
     <w:tmpl w:val="2E0E1E7C"/>
@@ -1214,7 +1245,7 @@
       </w:rPr>
     </w:lvl>
   </w:abstractNum>
-  <w:abstractNum w:abstractNumId="2" w15:restartNumberingAfterBreak="0">
+  <w:abstractNum w:abstractNumId="3" w15:restartNumberingAfterBreak="0">
     <w:nsid w:val="279A7AC6"/>
     <w:multiLevelType w:val="hybridMultilevel"/>
     <w:tmpl w:val="2FF679E4"/>
@@ -1303,7 +1334,7 @@
       </w:pPr>
     </w:lvl>
   </w:abstractNum>
-  <w:abstractNum w:abstractNumId="3" w15:restartNumberingAfterBreak="0">
+  <w:abstractNum w:abstractNumId="4" w15:restartNumberingAfterBreak="0">
     <w:nsid w:val="2D2A5264"/>
     <w:multiLevelType w:val="hybridMultilevel"/>
     <w:tmpl w:val="0DA0FF84"/>
@@ -1392,7 +1423,7 @@
       </w:pPr>
     </w:lvl>
   </w:abstractNum>
-  <w:abstractNum w:abstractNumId="4" w15:restartNumberingAfterBreak="0">
+  <w:abstractNum w:abstractNumId="5" w15:restartNumberingAfterBreak="0">
     <w:nsid w:val="2EF3516B"/>
     <w:multiLevelType w:val="hybridMultilevel"/>
     <w:tmpl w:val="E78CA46E"/>
@@ -1481,7 +1512,7 @@
       </w:pPr>
     </w:lvl>
   </w:abstractNum>
-  <w:abstractNum w:abstractNumId="5" w15:restartNumberingAfterBreak="0">
+  <w:abstractNum w:abstractNumId="6" w15:restartNumberingAfterBreak="0">
     <w:nsid w:val="3A940F1B"/>
     <w:multiLevelType w:val="hybridMultilevel"/>
     <w:tmpl w:val="CCAC563C"/>
@@ -1570,7 +1601,7 @@
       </w:pPr>
     </w:lvl>
   </w:abstractNum>
-  <w:abstractNum w:abstractNumId="6" w15:restartNumberingAfterBreak="0">
+  <w:abstractNum w:abstractNumId="7" w15:restartNumberingAfterBreak="0">
     <w:nsid w:val="438576B6"/>
     <w:multiLevelType w:val="hybridMultilevel"/>
     <w:tmpl w:val="3494A2AE"/>
@@ -1659,7 +1690,7 @@
       </w:pPr>
     </w:lvl>
   </w:abstractNum>
-  <w:abstractNum w:abstractNumId="7" w15:restartNumberingAfterBreak="0">
+  <w:abstractNum w:abstractNumId="8" w15:restartNumberingAfterBreak="0">
     <w:nsid w:val="45E47A02"/>
     <w:multiLevelType w:val="hybridMultilevel"/>
     <w:tmpl w:val="C78E3E8E"/>
@@ -1772,7 +1803,7 @@
       </w:rPr>
     </w:lvl>
   </w:abstractNum>
-  <w:abstractNum w:abstractNumId="8" w15:restartNumberingAfterBreak="0">
+  <w:abstractNum w:abstractNumId="9" w15:restartNumberingAfterBreak="0">
     <w:nsid w:val="4C24355D"/>
     <w:multiLevelType w:val="hybridMultilevel"/>
     <w:tmpl w:val="52144EAA"/>
@@ -1861,7 +1892,7 @@
       </w:pPr>
     </w:lvl>
   </w:abstractNum>
-  <w:abstractNum w:abstractNumId="9" w15:restartNumberingAfterBreak="0">
+  <w:abstractNum w:abstractNumId="10" w15:restartNumberingAfterBreak="0">
     <w:nsid w:val="4C2F73F1"/>
     <w:multiLevelType w:val="hybridMultilevel"/>
     <w:tmpl w:val="1FB005AC"/>
@@ -1950,7 +1981,7 @@
       </w:pPr>
     </w:lvl>
   </w:abstractNum>
-  <w:abstractNum w:abstractNumId="10" w15:restartNumberingAfterBreak="0">
+  <w:abstractNum w:abstractNumId="11" w15:restartNumberingAfterBreak="0">
     <w:nsid w:val="4CC8647F"/>
     <w:multiLevelType w:val="hybridMultilevel"/>
     <w:tmpl w:val="93C6BE94"/>
@@ -2039,7 +2070,96 @@
       </w:pPr>
     </w:lvl>
   </w:abstractNum>
-  <w:abstractNum w:abstractNumId="11" w15:restartNumberingAfterBreak="0">
+  <w:abstractNum w:abstractNumId="12" w15:restartNumberingAfterBreak="0">
+    <w:nsid w:val="4F652DC5"/>
+    <w:multiLevelType w:val="hybridMultilevel"/>
+    <w:tmpl w:val="4DC00FEE"/>
+    <w:lvl w:ilvl="0" w:tplc="0809000F">
+      <w:start w:val="1"/>
+      <w:numFmt w:val="decimal"/>
+      <w:lvlText w:val="%1."/>
+      <w:lvlJc w:val="left"/>
+      <w:pPr>
+        <w:ind w:left="720" w:hanging="360"/>
+      </w:pPr>
+      <w:rPr>
+        <w:rFonts w:hint="default"/>
+      </w:rPr>
+    </w:lvl>
+    <w:lvl w:ilvl="1" w:tplc="08090019" w:tentative="1">
+      <w:start w:val="1"/>
+      <w:numFmt w:val="lowerLetter"/>
+      <w:lvlText w:val="%2."/>
+      <w:lvlJc w:val="left"/>
+      <w:pPr>
+        <w:ind w:left="1440" w:hanging="360"/>
+      </w:pPr>
+    </w:lvl>
+    <w:lvl w:ilvl="2" w:tplc="0809001B" w:tentative="1">
+      <w:start w:val="1"/>
+      <w:numFmt w:val="lowerRoman"/>
+      <w:lvlText w:val="%3."/>
+      <w:lvlJc w:val="right"/>
+      <w:pPr>
+        <w:ind w:left="2160" w:hanging="180"/>
+      </w:pPr>
+    </w:lvl>
+    <w:lvl w:ilvl="3" w:tplc="0809000F" w:tentative="1">
+      <w:start w:val="1"/>
+      <w:numFmt w:val="decimal"/>
+      <w:lvlText w:val="%4."/>
+      <w:lvlJc w:val="left"/>
+      <w:pPr>
+        <w:ind w:left="2880" w:hanging="360"/>
+      </w:pPr>
+    </w:lvl>
+    <w:lvl w:ilvl="4" w:tplc="08090019" w:tentative="1">
+      <w:start w:val="1"/>
+      <w:numFmt w:val="lowerLetter"/>
+      <w:lvlText w:val="%5."/>
+      <w:lvlJc w:val="left"/>
+      <w:pPr>
+        <w:ind w:left="3600" w:hanging="360"/>
+      </w:pPr>
+    </w:lvl>
+    <w:lvl w:ilvl="5" w:tplc="0809001B" w:tentative="1">
+      <w:start w:val="1"/>
+      <w:numFmt w:val="lowerRoman"/>
+      <w:lvlText w:val="%6."/>
+      <w:lvlJc w:val="right"/>
+      <w:pPr>
+        <w:ind w:left="4320" w:hanging="180"/>
+      </w:pPr>
+    </w:lvl>
+    <w:lvl w:ilvl="6" w:tplc="0809000F" w:tentative="1">
+      <w:start w:val="1"/>
+      <w:numFmt w:val="decimal"/>
+      <w:lvlText w:val="%7."/>
+      <w:lvlJc w:val="left"/>
+      <w:pPr>
+        <w:ind w:left="5040" w:hanging="360"/>
+      </w:pPr>
+    </w:lvl>
+    <w:lvl w:ilvl="7" w:tplc="08090019" w:tentative="1">
+      <w:start w:val="1"/>
+      <w:numFmt w:val="lowerLetter"/>
+      <w:lvlText w:val="%8."/>
+      <w:lvlJc w:val="left"/>
+      <w:pPr>
+        <w:ind w:left="5760" w:hanging="360"/>
+      </w:pPr>
+    </w:lvl>
+    <w:lvl w:ilvl="8" w:tplc="0809001B" w:tentative="1">
+      <w:start w:val="1"/>
+      <w:numFmt w:val="lowerRoman"/>
+      <w:lvlText w:val="%9."/>
+      <w:lvlJc w:val="right"/>
+      <w:pPr>
+        <w:ind w:left="6480" w:hanging="180"/>
+      </w:pPr>
+    </w:lvl>
+  </w:abstractNum>
+  <w:abstractNum w:abstractNumId="13" w15:restartNumberingAfterBreak="0">
     <w:nsid w:val="51B6788D"/>
     <w:multiLevelType w:val="hybridMultilevel"/>
     <w:tmpl w:val="70A6EADC"/>
@@ -2128,7 +2248,96 @@
       </w:pPr>
     </w:lvl>
   </w:abstractNum>
-  <w:abstractNum w:abstractNumId="12" w15:restartNumberingAfterBreak="0">
+  <w:abstractNum w:abstractNumId="14" w15:restartNumberingAfterBreak="0">
+    <w:nsid w:val="65F07C6E"/>
+    <w:multiLevelType w:val="hybridMultilevel"/>
+    <w:tmpl w:val="A2FE6362"/>
+    <w:lvl w:ilvl="0" w:tplc="0809000F">
+      <w:start w:val="1"/>
+      <w:numFmt w:val="decimal"/>
+      <w:lvlText w:val="%1."/>
+      <w:lvlJc w:val="left"/>
+      <w:pPr>
+        <w:ind w:left="720" w:hanging="360"/>
+      </w:pPr>
+      <w:rPr>
+        <w:rFonts w:hint="default"/>
+      </w:rPr>
+    </w:lvl>
+    <w:lvl w:ilvl="1" w:tplc="08090019" w:tentative="1">
+      <w:start w:val="1"/>
+      <w:numFmt w:val="lowerLetter"/>
+      <w:lvlText w:val="%2."/>
+      <w:lvlJc w:val="left"/>
+      <w:pPr>
+        <w:ind w:left="1440" w:hanging="360"/>
+      </w:pPr>
+    </w:lvl>
+    <w:lvl w:ilvl="2" w:tplc="0809001B" w:tentative="1">
+      <w:start w:val="1"/>
+      <w:numFmt w:val="lowerRoman"/>
+      <w:lvlText w:val="%3."/>
+      <w:lvlJc w:val="right"/>
+      <w:pPr>
+        <w:ind w:left="2160" w:hanging="180"/>
+      </w:pPr>
+    </w:lvl>
+    <w:lvl w:ilvl="3" w:tplc="0809000F" w:tentative="1">
+      <w:start w:val="1"/>
+      <w:numFmt w:val="decimal"/>
+      <w:lvlText w:val="%4."/>
+      <w:lvlJc w:val="left"/>
+      <w:pPr>
+        <w:ind w:left="2880" w:hanging="360"/>
+      </w:pPr>
+    </w:lvl>
+    <w:lvl w:ilvl="4" w:tplc="08090019" w:tentative="1">
+      <w:start w:val="1"/>
+      <w:numFmt w:val="lowerLetter"/>
+      <w:lvlText w:val="%5."/>
+      <w:lvlJc w:val="left"/>
+      <w:pPr>
+        <w:ind w:left="3600" w:hanging="360"/>
+      </w:pPr>
+    </w:lvl>
+    <w:lvl w:ilvl="5" w:tplc="0809001B" w:tentative="1">
+      <w:start w:val="1"/>
+      <w:numFmt w:val="lowerRoman"/>
+      <w:lvlText w:val="%6."/>
+      <w:lvlJc w:val="right"/>
+      <w:pPr>
+        <w:ind w:left="4320" w:hanging="180"/>
+      </w:pPr>
+    </w:lvl>
+    <w:lvl w:ilvl="6" w:tplc="0809000F" w:tentative="1">
+      <w:start w:val="1"/>
+      <w:numFmt w:val="decimal"/>
+      <w:lvlText w:val="%7."/>
+      <w:lvlJc w:val="left"/>
+      <w:pPr>
+        <w:ind w:left="5040" w:hanging="360"/>
+      </w:pPr>
+    </w:lvl>
+    <w:lvl w:ilvl="7" w:tplc="08090019" w:tentative="1">
+      <w:start w:val="1"/>
+      <w:numFmt w:val="lowerLetter"/>
+      <w:lvlText w:val="%8."/>
+      <w:lvlJc w:val="left"/>
+      <w:pPr>
+        <w:ind w:left="5760" w:hanging="360"/>
+      </w:pPr>
+    </w:lvl>
+    <w:lvl w:ilvl="8" w:tplc="0809001B" w:tentative="1">
+      <w:start w:val="1"/>
+      <w:numFmt w:val="lowerRoman"/>
+      <w:lvlText w:val="%9."/>
+      <w:lvlJc w:val="right"/>
+      <w:pPr>
+        <w:ind w:left="6480" w:hanging="180"/>
+      </w:pPr>
+    </w:lvl>
+  </w:abstractNum>
+  <w:abstractNum w:abstractNumId="15" w15:restartNumberingAfterBreak="0">
     <w:nsid w:val="66E65A69"/>
     <w:multiLevelType w:val="hybridMultilevel"/>
     <w:tmpl w:val="83E097AC"/>
@@ -2217,7 +2426,7 @@
       </w:pPr>
     </w:lvl>
   </w:abstractNum>
-  <w:abstractNum w:abstractNumId="13" w15:restartNumberingAfterBreak="0">
+  <w:abstractNum w:abstractNumId="16" w15:restartNumberingAfterBreak="0">
     <w:nsid w:val="7C896FF8"/>
     <w:multiLevelType w:val="hybridMultilevel"/>
     <w:tmpl w:val="0CC8ADF8"/>
@@ -2307,46 +2516,55 @@
     </w:lvl>
   </w:abstractNum>
   <w:num w:numId="1" w16cid:durableId="385642863">
+    <w:abstractNumId w:val="8"/>
+  </w:num>
+  <w:num w:numId="2" w16cid:durableId="665088174">
+    <w:abstractNumId w:val="16"/>
+  </w:num>
+  <w:num w:numId="3" w16cid:durableId="435172547">
+    <w:abstractNumId w:val="11"/>
+  </w:num>
+  <w:num w:numId="4" w16cid:durableId="205796072">
+    <w:abstractNumId w:val="2"/>
+  </w:num>
+  <w:num w:numId="5" w16cid:durableId="519440871">
     <w:abstractNumId w:val="7"/>
   </w:num>
-  <w:num w:numId="2" w16cid:durableId="665088174">
+  <w:num w:numId="6" w16cid:durableId="112749846">
     <w:abstractNumId w:val="13"/>
   </w:num>
-  <w:num w:numId="3" w16cid:durableId="435172547">
+  <w:num w:numId="7" w16cid:durableId="452990242">
+    <w:abstractNumId w:val="6"/>
+  </w:num>
+  <w:num w:numId="8" w16cid:durableId="1070613449">
+    <w:abstractNumId w:val="15"/>
+  </w:num>
+  <w:num w:numId="9" w16cid:durableId="1045716424">
+    <w:abstractNumId w:val="1"/>
+  </w:num>
+  <w:num w:numId="10" w16cid:durableId="708918496">
+    <w:abstractNumId w:val="9"/>
+  </w:num>
+  <w:num w:numId="11" w16cid:durableId="930699933">
     <w:abstractNumId w:val="10"/>
   </w:num>
-  <w:num w:numId="4" w16cid:durableId="205796072">
-    <w:abstractNumId w:val="1"/>
+  <w:num w:numId="12" w16cid:durableId="972322050">
+    <w:abstractNumId w:val="3"/>
   </w:num>
-  <w:num w:numId="5" w16cid:durableId="519440871">
-    <w:abstractNumId w:val="6"/>
+  <w:num w:numId="13" w16cid:durableId="1156191506">
+    <w:abstractNumId w:val="4"/>
   </w:num>
-  <w:num w:numId="6" w16cid:durableId="112749846">
-    <w:abstractNumId w:val="11"/>
-  </w:num>
-  <w:num w:numId="7" w16cid:durableId="452990242">
+  <w:num w:numId="14" w16cid:durableId="1534608421">
     <w:abstractNumId w:val="5"/>
   </w:num>
-  <w:num w:numId="8" w16cid:durableId="1070613449">
-    <w:abstractNumId w:val="12"/>
-  </w:num>
-  <w:num w:numId="9" w16cid:durableId="1045716424">
+  <w:num w:numId="15" w16cid:durableId="1205481169">
     <w:abstractNumId w:val="0"/>
   </w:num>
-  <w:num w:numId="10" w16cid:durableId="708918496">
-    <w:abstractNumId w:val="8"/>
+  <w:num w:numId="16" w16cid:durableId="1634480893">
+    <w:abstractNumId w:val="14"/>
   </w:num>
-  <w:num w:numId="11" w16cid:durableId="930699933">
-    <w:abstractNumId w:val="9"/>
-  </w:num>
-  <w:num w:numId="12" w16cid:durableId="972322050">
-    <w:abstractNumId w:val="2"/>
-  </w:num>
-  <w:num w:numId="13" w16cid:durableId="1156191506">
-    <w:abstractNumId w:val="3"/>
-  </w:num>
-  <w:num w:numId="14" w16cid:durableId="1534608421">
-    <w:abstractNumId w:val="4"/>
+  <w:num w:numId="17" w16cid:durableId="1429765462">
+    <w:abstractNumId w:val="12"/>
   </w:num>
 </w:numbering>
 </file>
@@ -2954,7 +3172,6 @@
   <w:style w:type="character" w:default="1" w:styleId="DefaultParagraphFont">
     <w:name w:val="Default Paragraph Font"/>
     <w:uiPriority w:val="1"/>
-    <w:semiHidden/>
     <w:unhideWhenUsed/>
   </w:style>
   <w:style w:type="table" w:default="1" w:styleId="TableNormal">

</xml_diff>